<commit_message>
Checkpoint 07:17_19/06/26 saved at 2026-06-19_07-17-38
</commit_message>
<xml_diff>
--- a/backend/templates/BALANCE_INVOICE/template.docx
+++ b/backend/templates/BALANCE_INVOICE/template.docx
@@ -10,11 +10,11 @@
         <w:tblLook w:val="0620" w:firstRow="1" w:lastRow="0" w:firstColumn="0" w:lastColumn="0" w:noHBand="1" w:noVBand="1"/>
       </w:tblPr>
       <w:tblGrid>
-        <w:gridCol w:w="1446"/>
-        <w:gridCol w:w="4384"/>
-        <w:gridCol w:w="1541"/>
-        <w:gridCol w:w="1445"/>
-        <w:gridCol w:w="2506"/>
+        <w:gridCol w:w="1395"/>
+        <w:gridCol w:w="3898"/>
+        <w:gridCol w:w="1543"/>
+        <w:gridCol w:w="1395"/>
+        <w:gridCol w:w="3091"/>
       </w:tblGrid>
       <w:tr>
         <w:trPr>
@@ -49,7 +49,7 @@
         </w:tc>
         <w:tc>
           <w:tcPr>
-            <w:tcW w:w="4231" w:type="dxa"/>
+            <w:tcW w:w="4384" w:type="dxa"/>
             <w:tcBorders>
               <w:top w:val="single" w:sz="12" w:space="0" w:color="auto"/>
               <w:left w:val="single" w:sz="4" w:space="0" w:color="auto"/>
@@ -75,7 +75,7 @@
         </w:tc>
         <w:tc>
           <w:tcPr>
-            <w:tcW w:w="1131" w:type="dxa"/>
+            <w:tcW w:w="1541" w:type="dxa"/>
             <w:tcBorders>
               <w:top w:val="single" w:sz="12" w:space="0" w:color="auto"/>
               <w:left w:val="single" w:sz="4" w:space="0" w:color="auto"/>
@@ -240,7 +240,7 @@
         </w:tc>
         <w:tc>
           <w:tcPr>
-            <w:tcW w:w="4231" w:type="dxa"/>
+            <w:tcW w:w="4384" w:type="dxa"/>
             <w:tcBorders>
               <w:top w:val="single" w:sz="4" w:space="0" w:color="auto"/>
               <w:left w:val="single" w:sz="4" w:space="0" w:color="auto"/>
@@ -284,7 +284,7 @@
         </w:tc>
         <w:tc>
           <w:tcPr>
-            <w:tcW w:w="1131" w:type="dxa"/>
+            <w:tcW w:w="1541" w:type="dxa"/>
             <w:tcBorders>
               <w:top w:val="single" w:sz="4" w:space="0" w:color="auto"/>
               <w:left w:val="single" w:sz="4" w:space="0" w:color="auto"/>
@@ -292,37 +292,6 @@
               <w:right w:val="single" w:sz="4" w:space="0" w:color="auto"/>
             </w:tcBorders>
           </w:tcPr>
-          <w:p>
-            <w:pPr>
-              <w:rPr>
-                <w:rFonts w:ascii="TT Norms Regular" w:hAnsi="TT Norms Regular"/>
-                <w:szCs w:val="20"/>
-              </w:rPr>
-            </w:pPr>
-            <w:r>
-              <w:rPr>
-                <w:rFonts w:ascii="TT Norms Regular" w:hAnsi="TT Norms Regular"/>
-                <w:szCs w:val="20"/>
-              </w:rPr>
-              <w:t>{{</w:t>
-            </w:r>
-            <w:proofErr w:type="spellStart"/>
-            <w:r>
-              <w:rPr>
-                <w:rFonts w:ascii="TT Norms Regular" w:hAnsi="TT Norms Regular"/>
-                <w:szCs w:val="20"/>
-              </w:rPr>
-              <w:t>item.qty</w:t>
-            </w:r>
-            <w:proofErr w:type="spellEnd"/>
-            <w:r>
-              <w:rPr>
-                <w:rFonts w:ascii="TT Norms Regular" w:hAnsi="TT Norms Regular"/>
-                <w:szCs w:val="20"/>
-              </w:rPr>
-              <w:t>}}</w:t>
-            </w:r>
-          </w:p>
           <w:p>
             <w:pPr>
               <w:rPr>
@@ -469,7 +438,7 @@
         </w:tc>
         <w:tc>
           <w:tcPr>
-            <w:tcW w:w="4231" w:type="dxa"/>
+            <w:tcW w:w="4384" w:type="dxa"/>
             <w:tcBorders>
               <w:top w:val="single" w:sz="4" w:space="0" w:color="auto"/>
               <w:left w:val="single" w:sz="4" w:space="0" w:color="auto"/>
@@ -488,7 +457,7 @@
         </w:tc>
         <w:tc>
           <w:tcPr>
-            <w:tcW w:w="1131" w:type="dxa"/>
+            <w:tcW w:w="1541" w:type="dxa"/>
             <w:tcBorders>
               <w:top w:val="single" w:sz="4" w:space="0" w:color="auto"/>
               <w:left w:val="single" w:sz="4" w:space="0" w:color="auto"/>
@@ -812,27 +781,69 @@
               <w:jc w:val="right"/>
               <w:rPr>
                 <w:rFonts w:ascii="TT Norms Regular" w:hAnsi="TT Norms Regular"/>
-                <w:b/>
-                <w:bCs/>
                 <w:szCs w:val="20"/>
               </w:rPr>
             </w:pPr>
             <w:r>
               <w:rPr>
                 <w:rFonts w:ascii="TT Norms Regular" w:hAnsi="TT Norms Regular"/>
-                <w:b/>
-                <w:bCs/>
-                <w:color w:val="EE0000"/>
                 <w:szCs w:val="20"/>
               </w:rPr>
-              <w:t>DEPOSIT REQUIRED</w:t>
+              <w:t>{{</w:t>
+            </w:r>
+            <w:proofErr w:type="spellStart"/>
+            <w:proofErr w:type="gramStart"/>
+            <w:r>
+              <w:rPr>
+                <w:rFonts w:ascii="TT Norms Regular" w:hAnsi="TT Norms Regular"/>
+                <w:szCs w:val="20"/>
+              </w:rPr>
+              <w:t>payment.date</w:t>
+            </w:r>
+            <w:proofErr w:type="spellEnd"/>
+            <w:proofErr w:type="gramEnd"/>
+            <w:r>
+              <w:rPr>
+                <w:rFonts w:ascii="TT Norms Regular" w:hAnsi="TT Norms Regular"/>
+                <w:szCs w:val="20"/>
+              </w:rPr>
+              <w:t>}}</w:t>
             </w:r>
             <w:r>
               <w:rPr>
                 <w:rFonts w:ascii="TT Norms Regular" w:hAnsi="TT Norms Regular"/>
-                <w:b/>
-                <w:bCs/>
-                <w:color w:val="EE0000"/>
+                <w:szCs w:val="20"/>
+              </w:rPr>
+              <w:t xml:space="preserve"> - </w:t>
+            </w:r>
+            <w:r>
+              <w:rPr>
+                <w:rFonts w:ascii="TT Norms Regular" w:hAnsi="TT Norms Regular"/>
+                <w:szCs w:val="20"/>
+              </w:rPr>
+              <w:t>{{</w:t>
+            </w:r>
+            <w:proofErr w:type="spellStart"/>
+            <w:proofErr w:type="gramStart"/>
+            <w:r>
+              <w:rPr>
+                <w:rFonts w:ascii="TT Norms Regular" w:hAnsi="TT Norms Regular"/>
+                <w:szCs w:val="20"/>
+              </w:rPr>
+              <w:t>payment.reference</w:t>
+            </w:r>
+            <w:proofErr w:type="spellEnd"/>
+            <w:proofErr w:type="gramEnd"/>
+            <w:r>
+              <w:rPr>
+                <w:rFonts w:ascii="TT Norms Regular" w:hAnsi="TT Norms Regular"/>
+                <w:szCs w:val="20"/>
+              </w:rPr>
+              <w:t>}}</w:t>
+            </w:r>
+            <w:r>
+              <w:rPr>
+                <w:rFonts w:ascii="TT Norms Regular" w:hAnsi="TT Norms Regular"/>
                 <w:szCs w:val="20"/>
               </w:rPr>
               <w:t>:</w:t>
@@ -861,7 +872,96 @@
                 <w:rFonts w:ascii="TT Norms Regular" w:hAnsi="TT Norms Regular"/>
                 <w:szCs w:val="20"/>
               </w:rPr>
-              <w:t>{{DEPOSIT}}</w:t>
+              <w:t>{{</w:t>
+            </w:r>
+            <w:proofErr w:type="spellStart"/>
+            <w:proofErr w:type="gramStart"/>
+            <w:r>
+              <w:rPr>
+                <w:rFonts w:ascii="TT Norms Regular" w:hAnsi="TT Norms Regular"/>
+                <w:szCs w:val="20"/>
+              </w:rPr>
+              <w:t>payment.amount</w:t>
+            </w:r>
+            <w:proofErr w:type="spellEnd"/>
+            <w:proofErr w:type="gramEnd"/>
+            <w:r>
+              <w:rPr>
+                <w:rFonts w:ascii="TT Norms Regular" w:hAnsi="TT Norms Regular"/>
+                <w:szCs w:val="20"/>
+              </w:rPr>
+              <w:t>}}</w:t>
+            </w:r>
+          </w:p>
+        </w:tc>
+      </w:tr>
+      <w:tr>
+        <w:trPr>
+          <w:trHeight w:val="319"/>
+        </w:trPr>
+        <w:tc>
+          <w:tcPr>
+            <w:tcW w:w="8816" w:type="dxa"/>
+            <w:gridSpan w:val="4"/>
+            <w:tcBorders>
+              <w:top w:val="single" w:sz="12" w:space="0" w:color="auto"/>
+              <w:left w:val="single" w:sz="12" w:space="0" w:color="auto"/>
+              <w:bottom w:val="single" w:sz="12" w:space="0" w:color="auto"/>
+              <w:right w:val="single" w:sz="4" w:space="0" w:color="auto"/>
+            </w:tcBorders>
+          </w:tcPr>
+          <w:p>
+            <w:pPr>
+              <w:jc w:val="right"/>
+              <w:rPr>
+                <w:rFonts w:ascii="TT Norms Regular" w:hAnsi="TT Norms Regular"/>
+                <w:b/>
+                <w:bCs/>
+                <w:color w:val="EE0000"/>
+                <w:szCs w:val="20"/>
+              </w:rPr>
+            </w:pPr>
+            <w:r>
+              <w:rPr>
+                <w:rFonts w:ascii="TT Norms Regular" w:hAnsi="TT Norms Regular"/>
+                <w:b/>
+                <w:bCs/>
+                <w:color w:val="EE0000"/>
+                <w:szCs w:val="20"/>
+              </w:rPr>
+              <w:t>BALANCE OUTSTANDING:</w:t>
+            </w:r>
+          </w:p>
+        </w:tc>
+        <w:tc>
+          <w:tcPr>
+            <w:tcW w:w="2506" w:type="dxa"/>
+            <w:tcBorders>
+              <w:top w:val="single" w:sz="12" w:space="0" w:color="auto"/>
+              <w:left w:val="single" w:sz="4" w:space="0" w:color="auto"/>
+              <w:bottom w:val="single" w:sz="12" w:space="0" w:color="auto"/>
+              <w:right w:val="single" w:sz="12" w:space="0" w:color="auto"/>
+            </w:tcBorders>
+          </w:tcPr>
+          <w:p>
+            <w:pPr>
+              <w:rPr>
+                <w:rFonts w:ascii="TT Norms Regular" w:hAnsi="TT Norms Regular"/>
+                <w:b/>
+                <w:bCs/>
+                <w:color w:val="EE0000"/>
+                <w:szCs w:val="20"/>
+              </w:rPr>
+            </w:pPr>
+            <w:r>
+              <w:rPr>
+                <w:rFonts w:ascii="TT Norms Regular" w:hAnsi="TT Norms Regular"/>
+                <w:b/>
+                <w:bCs/>
+                <w:color w:val="EE0000"/>
+                <w:szCs w:val="20"/>
+              </w:rPr>
+              <w:t>{{BALANCE_OUTSTANDING}}</w:t>
             </w:r>
           </w:p>
         </w:tc>
@@ -880,12 +980,8 @@
       </w:pPr>
     </w:p>
     <w:sectPr>
-      <w:headerReference w:type="even" r:id="rId8"/>
-      <w:headerReference w:type="default" r:id="rId9"/>
-      <w:footerReference w:type="even" r:id="rId10"/>
-      <w:footerReference w:type="default" r:id="rId11"/>
-      <w:headerReference w:type="first" r:id="rId12"/>
-      <w:footerReference w:type="first" r:id="rId13"/>
+      <w:headerReference w:type="default" r:id="rId8"/>
+      <w:footerReference w:type="default" r:id="rId9"/>
       <w:pgSz w:w="12240" w:h="15840"/>
       <w:pgMar w:top="851" w:right="567" w:bottom="851" w:left="567" w:header="720" w:footer="720" w:gutter="0"/>
       <w:cols w:space="720"/>
@@ -925,16 +1021,6 @@
   <w:p>
     <w:pPr>
       <w:pStyle w:val="Footer"/>
-    </w:pPr>
-  </w:p>
-</w:ftr>
-</file>
-
-<file path=word/footer2.xml><?xml version="1.0" encoding="utf-8"?>
-<w:ftr xmlns:wpc="http://schemas.microsoft.com/office/word/2010/wordprocessingCanvas" xmlns:cx="http://schemas.microsoft.com/office/drawing/2014/chartex" xmlns:cx1="http://schemas.microsoft.com/office/drawing/2015/9/8/chartex" xmlns:cx2="http://schemas.microsoft.com/office/drawing/2015/10/21/chartex" xmlns:cx3="http://schemas.microsoft.com/office/drawing/2016/5/9/chartex" xmlns:cx4="http://schemas.microsoft.com/office/drawing/2016/5/10/chartex" xmlns:cx5="http://schemas.microsoft.com/office/drawing/2016/5/11/chartex" xmlns:cx6="http://schemas.microsoft.com/office/drawing/2016/5/12/chartex" xmlns:cx7="http://schemas.microsoft.com/office/drawing/2016/5/13/chartex" xmlns:cx8="http://schemas.microsoft.com/office/drawing/2016/5/14/chartex" xmlns:mc="http://schemas.openxmlformats.org/markup-compatibility/2006" xmlns:aink="http://schemas.microsoft.com/office/drawing/2016/ink" xmlns:am3d="http://schemas.microsoft.com/office/drawing/2017/model3d" xmlns:o="urn:schemas-microsoft-com:office:office" xmlns:oel="http://schemas.microsoft.com/office/2019/extlst" xmlns:r="http://schemas.openxmlformats.org/officeDocument/2006/relationships" xmlns:m="http://schemas.openxmlformats.org/officeDocument/2006/math" xmlns:v="urn:schemas-microsoft-com:vml" xmlns:wp14="http://schemas.microsoft.com/office/word/2010/wordprocessingDrawing" xmlns:wp="http://schemas.openxmlformats.org/drawingml/2006/wordprocessingDrawing" xmlns:w10="urn:schemas-microsoft-com:office:word" xmlns:w="http://schemas.openxmlformats.org/wordprocessingml/2006/main" xmlns:w14="http://schemas.microsoft.com/office/word/2010/wordml" xmlns:w15="http://schemas.microsoft.com/office/word/2012/wordml" xmlns:w16cex="http://schemas.microsoft.com/office/word/2018/wordml/cex" xmlns:w16cid="http://schemas.microsoft.com/office/word/2016/wordml/cid" xmlns:w16="http://schemas.microsoft.com/office/word/2018/wordml" xmlns:w16du="http://schemas.microsoft.com/office/word/2023/wordml/word16du" xmlns:w16sdtdh="http://schemas.microsoft.com/office/word/2020/wordml/sdtdatahash" xmlns:w16sdtfl="http://schemas.microsoft.com/office/word/2024/wordml/sdtformatlock" xmlns:w16se="http://schemas.microsoft.com/office/word/2015/wordml/symex" xmlns:wpg="http://schemas.microsoft.com/office/word/2010/wordprocessingGroup" xmlns:wpi="http://schemas.microsoft.com/office/word/2010/wordprocessingInk" xmlns:wne="http://schemas.microsoft.com/office/word/2006/wordml" xmlns:wps="http://schemas.microsoft.com/office/word/2010/wordprocessingShape" mc:Ignorable="w14 w15 w16se w16cid w16 w16cex w16sdtdh w16sdtfl w16du wp14">
-  <w:p>
-    <w:pPr>
-      <w:pStyle w:val="Footer"/>
       <w:rPr>
         <w:rFonts w:ascii="TT Norms Regular" w:hAnsi="TT Norms Regular"/>
         <w:color w:val="EE0000"/>
@@ -1139,16 +1225,6 @@
       </w:rPr>
       <w:t>VAT No: 4590312965 - Reg No. 2022/863083/07 - Tell No. 087 711 0660</w:t>
     </w:r>
-  </w:p>
-</w:ftr>
-</file>
-
-<file path=word/footer3.xml><?xml version="1.0" encoding="utf-8"?>
-<w:ftr xmlns:wpc="http://schemas.microsoft.com/office/word/2010/wordprocessingCanvas" xmlns:cx="http://schemas.microsoft.com/office/drawing/2014/chartex" xmlns:cx1="http://schemas.microsoft.com/office/drawing/2015/9/8/chartex" xmlns:cx2="http://schemas.microsoft.com/office/drawing/2015/10/21/chartex" xmlns:cx3="http://schemas.microsoft.com/office/drawing/2016/5/9/chartex" xmlns:cx4="http://schemas.microsoft.com/office/drawing/2016/5/10/chartex" xmlns:cx5="http://schemas.microsoft.com/office/drawing/2016/5/11/chartex" xmlns:cx6="http://schemas.microsoft.com/office/drawing/2016/5/12/chartex" xmlns:cx7="http://schemas.microsoft.com/office/drawing/2016/5/13/chartex" xmlns:cx8="http://schemas.microsoft.com/office/drawing/2016/5/14/chartex" xmlns:mc="http://schemas.openxmlformats.org/markup-compatibility/2006" xmlns:aink="http://schemas.microsoft.com/office/drawing/2016/ink" xmlns:am3d="http://schemas.microsoft.com/office/drawing/2017/model3d" xmlns:o="urn:schemas-microsoft-com:office:office" xmlns:oel="http://schemas.microsoft.com/office/2019/extlst" xmlns:r="http://schemas.openxmlformats.org/officeDocument/2006/relationships" xmlns:m="http://schemas.openxmlformats.org/officeDocument/2006/math" xmlns:v="urn:schemas-microsoft-com:vml" xmlns:wp14="http://schemas.microsoft.com/office/word/2010/wordprocessingDrawing" xmlns:wp="http://schemas.openxmlformats.org/drawingml/2006/wordprocessingDrawing" xmlns:w10="urn:schemas-microsoft-com:office:word" xmlns:w="http://schemas.openxmlformats.org/wordprocessingml/2006/main" xmlns:w14="http://schemas.microsoft.com/office/word/2010/wordml" xmlns:w15="http://schemas.microsoft.com/office/word/2012/wordml" xmlns:w16cex="http://schemas.microsoft.com/office/word/2018/wordml/cex" xmlns:w16cid="http://schemas.microsoft.com/office/word/2016/wordml/cid" xmlns:w16="http://schemas.microsoft.com/office/word/2018/wordml" xmlns:w16du="http://schemas.microsoft.com/office/word/2023/wordml/word16du" xmlns:w16sdtdh="http://schemas.microsoft.com/office/word/2020/wordml/sdtdatahash" xmlns:w16sdtfl="http://schemas.microsoft.com/office/word/2024/wordml/sdtformatlock" xmlns:w16se="http://schemas.microsoft.com/office/word/2015/wordml/symex" xmlns:wpg="http://schemas.microsoft.com/office/word/2010/wordprocessingGroup" xmlns:wpi="http://schemas.microsoft.com/office/word/2010/wordprocessingInk" xmlns:wne="http://schemas.microsoft.com/office/word/2006/wordml" xmlns:wps="http://schemas.microsoft.com/office/word/2010/wordprocessingShape" mc:Ignorable="w14 w15 w16se w16cid w16 w16cex w16sdtdh w16sdtfl w16du wp14">
-  <w:p>
-    <w:pPr>
-      <w:pStyle w:val="Footer"/>
-    </w:pPr>
   </w:p>
 </w:ftr>
 </file>
@@ -1179,16 +1255,6 @@
 </file>
 
 <file path=word/header1.xml><?xml version="1.0" encoding="utf-8"?>
-<w:hdr xmlns:wpc="http://schemas.microsoft.com/office/word/2010/wordprocessingCanvas" xmlns:cx="http://schemas.microsoft.com/office/drawing/2014/chartex" xmlns:cx1="http://schemas.microsoft.com/office/drawing/2015/9/8/chartex" xmlns:cx2="http://schemas.microsoft.com/office/drawing/2015/10/21/chartex" xmlns:cx3="http://schemas.microsoft.com/office/drawing/2016/5/9/chartex" xmlns:cx4="http://schemas.microsoft.com/office/drawing/2016/5/10/chartex" xmlns:cx5="http://schemas.microsoft.com/office/drawing/2016/5/11/chartex" xmlns:cx6="http://schemas.microsoft.com/office/drawing/2016/5/12/chartex" xmlns:cx7="http://schemas.microsoft.com/office/drawing/2016/5/13/chartex" xmlns:cx8="http://schemas.microsoft.com/office/drawing/2016/5/14/chartex" xmlns:mc="http://schemas.openxmlformats.org/markup-compatibility/2006" xmlns:aink="http://schemas.microsoft.com/office/drawing/2016/ink" xmlns:am3d="http://schemas.microsoft.com/office/drawing/2017/model3d" xmlns:o="urn:schemas-microsoft-com:office:office" xmlns:oel="http://schemas.microsoft.com/office/2019/extlst" xmlns:r="http://schemas.openxmlformats.org/officeDocument/2006/relationships" xmlns:m="http://schemas.openxmlformats.org/officeDocument/2006/math" xmlns:v="urn:schemas-microsoft-com:vml" xmlns:wp14="http://schemas.microsoft.com/office/word/2010/wordprocessingDrawing" xmlns:wp="http://schemas.openxmlformats.org/drawingml/2006/wordprocessingDrawing" xmlns:w10="urn:schemas-microsoft-com:office:word" xmlns:w="http://schemas.openxmlformats.org/wordprocessingml/2006/main" xmlns:w14="http://schemas.microsoft.com/office/word/2010/wordml" xmlns:w15="http://schemas.microsoft.com/office/word/2012/wordml" xmlns:w16cex="http://schemas.microsoft.com/office/word/2018/wordml/cex" xmlns:w16cid="http://schemas.microsoft.com/office/word/2016/wordml/cid" xmlns:w16="http://schemas.microsoft.com/office/word/2018/wordml" xmlns:w16du="http://schemas.microsoft.com/office/word/2023/wordml/word16du" xmlns:w16sdtdh="http://schemas.microsoft.com/office/word/2020/wordml/sdtdatahash" xmlns:w16sdtfl="http://schemas.microsoft.com/office/word/2024/wordml/sdtformatlock" xmlns:w16se="http://schemas.microsoft.com/office/word/2015/wordml/symex" xmlns:wpg="http://schemas.microsoft.com/office/word/2010/wordprocessingGroup" xmlns:wpi="http://schemas.microsoft.com/office/word/2010/wordprocessingInk" xmlns:wne="http://schemas.microsoft.com/office/word/2006/wordml" xmlns:wps="http://schemas.microsoft.com/office/word/2010/wordprocessingShape" mc:Ignorable="w14 w15 w16se w16cid w16 w16cex w16sdtdh w16sdtfl w16du wp14">
-  <w:p>
-    <w:pPr>
-      <w:pStyle w:val="Header"/>
-    </w:pPr>
-  </w:p>
-</w:hdr>
-</file>
-
-<file path=word/header2.xml><?xml version="1.0" encoding="utf-8"?>
 <w:hdr xmlns:wpc="http://schemas.microsoft.com/office/word/2010/wordprocessingCanvas" xmlns:cx="http://schemas.microsoft.com/office/drawing/2014/chartex" xmlns:cx1="http://schemas.microsoft.com/office/drawing/2015/9/8/chartex" xmlns:cx2="http://schemas.microsoft.com/office/drawing/2015/10/21/chartex" xmlns:cx3="http://schemas.microsoft.com/office/drawing/2016/5/9/chartex" xmlns:cx4="http://schemas.microsoft.com/office/drawing/2016/5/10/chartex" xmlns:cx5="http://schemas.microsoft.com/office/drawing/2016/5/11/chartex" xmlns:cx6="http://schemas.microsoft.com/office/drawing/2016/5/12/chartex" xmlns:cx7="http://schemas.microsoft.com/office/drawing/2016/5/13/chartex" xmlns:cx8="http://schemas.microsoft.com/office/drawing/2016/5/14/chartex" xmlns:mc="http://schemas.openxmlformats.org/markup-compatibility/2006" xmlns:aink="http://schemas.microsoft.com/office/drawing/2016/ink" xmlns:am3d="http://schemas.microsoft.com/office/drawing/2017/model3d" xmlns:o="urn:schemas-microsoft-com:office:office" xmlns:oel="http://schemas.microsoft.com/office/2019/extlst" xmlns:r="http://schemas.openxmlformats.org/officeDocument/2006/relationships" xmlns:m="http://schemas.openxmlformats.org/officeDocument/2006/math" xmlns:v="urn:schemas-microsoft-com:vml" xmlns:wp14="http://schemas.microsoft.com/office/word/2010/wordprocessingDrawing" xmlns:wp="http://schemas.openxmlformats.org/drawingml/2006/wordprocessingDrawing" xmlns:w10="urn:schemas-microsoft-com:office:word" xmlns:w="http://schemas.openxmlformats.org/wordprocessingml/2006/main" xmlns:w14="http://schemas.microsoft.com/office/word/2010/wordml" xmlns:w15="http://schemas.microsoft.com/office/word/2012/wordml" xmlns:w16cex="http://schemas.microsoft.com/office/word/2018/wordml/cex" xmlns:w16cid="http://schemas.microsoft.com/office/word/2016/wordml/cid" xmlns:w16="http://schemas.microsoft.com/office/word/2018/wordml" xmlns:w16du="http://schemas.microsoft.com/office/word/2023/wordml/word16du" xmlns:w16sdtdh="http://schemas.microsoft.com/office/word/2020/wordml/sdtdatahash" xmlns:w16sdtfl="http://schemas.microsoft.com/office/word/2024/wordml/sdtformatlock" xmlns:w16se="http://schemas.microsoft.com/office/word/2015/wordml/symex" xmlns:wpg="http://schemas.microsoft.com/office/word/2010/wordprocessingGroup" xmlns:wpi="http://schemas.microsoft.com/office/word/2010/wordprocessingInk" xmlns:wne="http://schemas.microsoft.com/office/word/2006/wordml" xmlns:wps="http://schemas.microsoft.com/office/word/2010/wordprocessingShape" mc:Ignorable="w14 w15 w16se w16cid w16 w16cex w16sdtdh w16sdtfl w16du wp14">
   <w:p>
     <w:pPr>
@@ -1374,7 +1440,7 @@
         </mc:Choice>
         <mc:Fallback>
           <w:pict>
-            <v:line w14:anchorId="0C4E420B" id="Straight Connector 2" o:spid="_x0000_s1026" style="flip:x;visibility:visible;mso-wrap-style:square;mso-left-percent:-10001;mso-top-percent:-10001;mso-position-horizontal:absolute;mso-position-horizontal-relative:char;mso-position-vertical:absolute;mso-position-vertical-relative:line;mso-left-percent:-10001;mso-top-percent:-10001" from="0,0" to="541.5pt,0" o:gfxdata="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" strokecolor="black [3200]" strokeweight="2pt">
+            <v:line w14:anchorId="237AE22C" id="Straight Connector 2" o:spid="_x0000_s1026" style="flip:x;visibility:visible;mso-wrap-style:square;mso-left-percent:-10001;mso-top-percent:-10001;mso-position-horizontal:absolute;mso-position-horizontal-relative:char;mso-position-vertical:absolute;mso-position-vertical-relative:line;mso-left-percent:-10001;mso-top-percent:-10001" from="0,0" to="541.5pt,0" o:gfxdata="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" strokecolor="black [3200]" strokeweight="2pt">
               <v:shadow on="t" color="black" opacity="24903f" origin=",.5" offset="0,.55556mm"/>
               <w10:anchorlock/>
             </v:line>
@@ -2158,16 +2224,6 @@
         <w:bCs/>
         <w:szCs w:val="20"/>
       </w:rPr>
-    </w:pPr>
-  </w:p>
-</w:hdr>
-</file>
-
-<file path=word/header3.xml><?xml version="1.0" encoding="utf-8"?>
-<w:hdr xmlns:wpc="http://schemas.microsoft.com/office/word/2010/wordprocessingCanvas" xmlns:cx="http://schemas.microsoft.com/office/drawing/2014/chartex" xmlns:cx1="http://schemas.microsoft.com/office/drawing/2015/9/8/chartex" xmlns:cx2="http://schemas.microsoft.com/office/drawing/2015/10/21/chartex" xmlns:cx3="http://schemas.microsoft.com/office/drawing/2016/5/9/chartex" xmlns:cx4="http://schemas.microsoft.com/office/drawing/2016/5/10/chartex" xmlns:cx5="http://schemas.microsoft.com/office/drawing/2016/5/11/chartex" xmlns:cx6="http://schemas.microsoft.com/office/drawing/2016/5/12/chartex" xmlns:cx7="http://schemas.microsoft.com/office/drawing/2016/5/13/chartex" xmlns:cx8="http://schemas.microsoft.com/office/drawing/2016/5/14/chartex" xmlns:mc="http://schemas.openxmlformats.org/markup-compatibility/2006" xmlns:aink="http://schemas.microsoft.com/office/drawing/2016/ink" xmlns:am3d="http://schemas.microsoft.com/office/drawing/2017/model3d" xmlns:o="urn:schemas-microsoft-com:office:office" xmlns:oel="http://schemas.microsoft.com/office/2019/extlst" xmlns:r="http://schemas.openxmlformats.org/officeDocument/2006/relationships" xmlns:m="http://schemas.openxmlformats.org/officeDocument/2006/math" xmlns:v="urn:schemas-microsoft-com:vml" xmlns:wp14="http://schemas.microsoft.com/office/word/2010/wordprocessingDrawing" xmlns:wp="http://schemas.openxmlformats.org/drawingml/2006/wordprocessingDrawing" xmlns:w10="urn:schemas-microsoft-com:office:word" xmlns:w="http://schemas.openxmlformats.org/wordprocessingml/2006/main" xmlns:w14="http://schemas.microsoft.com/office/word/2010/wordml" xmlns:w15="http://schemas.microsoft.com/office/word/2012/wordml" xmlns:w16cex="http://schemas.microsoft.com/office/word/2018/wordml/cex" xmlns:w16cid="http://schemas.microsoft.com/office/word/2016/wordml/cid" xmlns:w16="http://schemas.microsoft.com/office/word/2018/wordml" xmlns:w16du="http://schemas.microsoft.com/office/word/2023/wordml/word16du" xmlns:w16sdtdh="http://schemas.microsoft.com/office/word/2020/wordml/sdtdatahash" xmlns:w16sdtfl="http://schemas.microsoft.com/office/word/2024/wordml/sdtformatlock" xmlns:w16se="http://schemas.microsoft.com/office/word/2015/wordml/symex" xmlns:wpg="http://schemas.microsoft.com/office/word/2010/wordprocessingGroup" xmlns:wpi="http://schemas.microsoft.com/office/word/2010/wordprocessingInk" xmlns:wne="http://schemas.microsoft.com/office/word/2006/wordml" xmlns:wps="http://schemas.microsoft.com/office/word/2010/wordprocessingShape" mc:Ignorable="w14 w15 w16se w16cid w16 w16cex w16sdtdh w16sdtfl w16du wp14">
-  <w:p>
-    <w:pPr>
-      <w:pStyle w:val="Header"/>
     </w:pPr>
   </w:p>
 </w:hdr>

</xml_diff>